<commit_message>
docs: update architecture, user manual, and REST API documentation for Data Movement & AI Insights
</commit_message>
<xml_diff>
--- a/OntoForge_Enterprise_Documentation.docx
+++ b/OntoForge_Enterprise_Documentation.docx
@@ -4051,6 +4051,248 @@
       </w:r>
     </w:p>
     <w:p>
+      <w:pPr>
+        <w:keepNext/>
+        <w:spacing w:before="280" w:after="120"/>
+      </w:pPr>
+      <w:r>
+        <w:rPr>
+          <w:rFonts w:ascii="Calibri" w:hAnsi="Calibri"/>
+          <w:b/>
+          <w:color w:val="4F46E5"/>
+          <w:sz w:val="28"/>
+        </w:rPr>
+        <w:t>3.7 Data Movement &amp; Migration Engine</w:t>
+      </w:r>
+    </w:p>
+    <w:p>
+      <w:pPr>
+        <w:spacing w:before="0" w:after="120" w:line="276" w:lineRule="auto"/>
+      </w:pPr>
+      <w:r>
+        <w:rPr>
+          <w:rFonts w:ascii="Calibri" w:hAnsi="Calibri"/>
+          <w:i w:val="0"/>
+          <w:color w:val="334155"/>
+          <w:sz w:val="21"/>
+        </w:rPr>
+        <w:t>The Data Movement Engine streams relational database records into Target Knowledge Graph instances (Neo4j, Memgraph, Apache AGE, AWS Neptune) mapped against W3C OWL 2.0 ontology topologies.</w:t>
+      </w:r>
+    </w:p>
+    <w:p>
+      <w:pPr>
+        <w:pStyle w:val="ListBullet"/>
+        <w:spacing w:before="20" w:after="60" w:line="276" w:lineRule="auto"/>
+      </w:pPr>
+      <w:r>
+        <w:rPr>
+          <w:rFonts w:ascii="Calibri" w:hAnsi="Calibri"/>
+          <w:b/>
+          <w:color w:val="0F172A"/>
+          <w:sz w:val="20"/>
+        </w:rPr>
+        <w:t xml:space="preserve">Automated Record Ingestion: </w:t>
+      </w:r>
+      <w:r>
+        <w:rPr>
+          <w:rFonts w:ascii="Calibri" w:hAnsi="Calibri"/>
+          <w:color w:val="334155"/>
+          <w:sz w:val="20"/>
+        </w:rPr>
+        <w:t>Extracts source database records and materializes graph nodes (:Label) with datatype properties and Object Property relationship edges (:RELATIONSHIP).</w:t>
+      </w:r>
+    </w:p>
+    <w:p>
+      <w:pPr>
+        <w:pStyle w:val="ListBullet"/>
+        <w:spacing w:before="20" w:after="60" w:line="276" w:lineRule="auto"/>
+      </w:pPr>
+      <w:r>
+        <w:rPr>
+          <w:rFonts w:ascii="Calibri" w:hAnsi="Calibri"/>
+          <w:b/>
+          <w:color w:val="0F172A"/>
+          <w:sz w:val="20"/>
+        </w:rPr>
+        <w:t xml:space="preserve">Visual 6-Stage Execution Stepper: </w:t>
+      </w:r>
+      <w:r>
+        <w:rPr>
+          <w:rFonts w:ascii="Calibri" w:hAnsi="Calibri"/>
+          <w:color w:val="334155"/>
+          <w:sz w:val="20"/>
+        </w:rPr>
+        <w:t>Live progress indicator tracking Extraction ➔ Ontology ➔ Validation ➔ Nodes ➔ Edges ➔ Commit stages.</w:t>
+      </w:r>
+    </w:p>
+    <w:p>
+      <w:pPr>
+        <w:pStyle w:val="ListBullet"/>
+        <w:spacing w:before="20" w:after="60" w:line="276" w:lineRule="auto"/>
+      </w:pPr>
+      <w:r>
+        <w:rPr>
+          <w:rFonts w:ascii="Calibri" w:hAnsi="Calibri"/>
+          <w:b/>
+          <w:color w:val="0F172A"/>
+          <w:sz w:val="20"/>
+        </w:rPr>
+        <w:t xml:space="preserve">Real-Time Terminal Monitor: </w:t>
+      </w:r>
+      <w:r>
+        <w:rPr>
+          <w:rFonts w:ascii="Calibri" w:hAnsi="Calibri"/>
+          <w:color w:val="334155"/>
+          <w:sz w:val="20"/>
+        </w:rPr>
+        <w:t>Streamed console logs displaying row extraction counts, node creation stats, validation pass rates, and total execution time in milliseconds.</w:t>
+      </w:r>
+    </w:p>
+    <w:p>
+      <w:pPr>
+        <w:pStyle w:val="ListBullet"/>
+        <w:spacing w:before="20" w:after="60" w:line="276" w:lineRule="auto"/>
+      </w:pPr>
+      <w:r>
+        <w:rPr>
+          <w:rFonts w:ascii="Calibri" w:hAnsi="Calibri"/>
+          <w:b/>
+          <w:color w:val="0F172A"/>
+          <w:sz w:val="20"/>
+        </w:rPr>
+        <w:t xml:space="preserve">Execution History Audit Trail: </w:t>
+      </w:r>
+      <w:r>
+        <w:rPr>
+          <w:rFonts w:ascii="Calibri" w:hAnsi="Calibri"/>
+          <w:color w:val="334155"/>
+          <w:sz w:val="20"/>
+        </w:rPr>
+        <w:t>Historical job execution table featuring inline 📜 Logs viewer and 🗑️ single/bulk audit record deletion.</w:t>
+      </w:r>
+    </w:p>
+    <w:p>
+      <w:pPr>
+        <w:keepNext/>
+        <w:spacing w:before="280" w:after="120"/>
+      </w:pPr>
+      <w:r>
+        <w:rPr>
+          <w:rFonts w:ascii="Calibri" w:hAnsi="Calibri"/>
+          <w:b/>
+          <w:color w:val="4F46E5"/>
+          <w:sz w:val="28"/>
+        </w:rPr>
+        <w:t>3.8 AI Knowledge Graph Insights &amp; Approved Cypher Repository</w:t>
+      </w:r>
+    </w:p>
+    <w:p>
+      <w:pPr>
+        <w:spacing w:before="0" w:after="120" w:line="276" w:lineRule="auto"/>
+      </w:pPr>
+      <w:r>
+        <w:rPr>
+          <w:rFonts w:ascii="Calibri" w:hAnsi="Calibri"/>
+          <w:i w:val="0"/>
+          <w:color w:val="334155"/>
+          <w:sz w:val="21"/>
+        </w:rPr>
+        <w:t>The AI Graph Insights subsystem translates natural language questions into schema-accurate Cypher queries, executing live against target graph databases to yield executive intelligence summaries.</w:t>
+      </w:r>
+    </w:p>
+    <w:p>
+      <w:pPr>
+        <w:pStyle w:val="ListBullet"/>
+        <w:spacing w:before="20" w:after="60" w:line="276" w:lineRule="auto"/>
+      </w:pPr>
+      <w:r>
+        <w:rPr>
+          <w:rFonts w:ascii="Calibri" w:hAnsi="Calibri"/>
+          <w:b/>
+          <w:color w:val="0F172A"/>
+          <w:sz w:val="20"/>
+        </w:rPr>
+        <w:t xml:space="preserve">Natural Language to Cypher: </w:t>
+      </w:r>
+      <w:r>
+        <w:rPr>
+          <w:rFonts w:ascii="Calibri" w:hAnsi="Calibri"/>
+          <w:color w:val="334155"/>
+          <w:sz w:val="20"/>
+        </w:rPr>
+        <w:t>Converts natural language questions (e.g. 'List all vendors') into optimized Cypher graph queries.</w:t>
+      </w:r>
+    </w:p>
+    <w:p>
+      <w:pPr>
+        <w:pStyle w:val="ListBullet"/>
+        <w:spacing w:before="20" w:after="60" w:line="276" w:lineRule="auto"/>
+      </w:pPr>
+      <w:r>
+        <w:rPr>
+          <w:rFonts w:ascii="Calibri" w:hAnsi="Calibri"/>
+          <w:b/>
+          <w:color w:val="0F172A"/>
+          <w:sz w:val="20"/>
+        </w:rPr>
+        <w:t xml:space="preserve">Dynamic Ontology Prompt Pills: </w:t>
+      </w:r>
+      <w:r>
+        <w:rPr>
+          <w:rFonts w:ascii="Calibri" w:hAnsi="Calibri"/>
+          <w:color w:val="334155"/>
+          <w:sz w:val="20"/>
+        </w:rPr>
+        <w:t>Live suggestion pills dynamically synthesized from project W3C OWL classes (e.g. :Vendor, :Invoice, :Contract, :Product).</w:t>
+      </w:r>
+    </w:p>
+    <w:p>
+      <w:pPr>
+        <w:pStyle w:val="ListBullet"/>
+        <w:spacing w:before="20" w:after="60" w:line="276" w:lineRule="auto"/>
+      </w:pPr>
+      <w:r>
+        <w:rPr>
+          <w:rFonts w:ascii="Calibri" w:hAnsi="Calibri"/>
+          <w:b/>
+          <w:color w:val="0F172A"/>
+          <w:sz w:val="20"/>
+        </w:rPr>
+        <w:t xml:space="preserve">Approved Few-Shot Repository: </w:t>
+      </w:r>
+      <w:r>
+        <w:rPr>
+          <w:rFonts w:ascii="Calibri" w:hAnsi="Calibri"/>
+          <w:color w:val="334155"/>
+          <w:sz w:val="20"/>
+        </w:rPr>
+        <w:t>Managed knowledge base storing approved Cypher queries for exact question matching.</w:t>
+      </w:r>
+    </w:p>
+    <w:p>
+      <w:pPr>
+        <w:pStyle w:val="ListBullet"/>
+        <w:spacing w:before="20" w:after="60" w:line="276" w:lineRule="auto"/>
+      </w:pPr>
+      <w:r>
+        <w:rPr>
+          <w:rFonts w:ascii="Calibri" w:hAnsi="Calibri"/>
+          <w:b/>
+          <w:color w:val="0F172A"/>
+          <w:sz w:val="20"/>
+        </w:rPr>
+        <w:t xml:space="preserve">Executive AI Summaries: </w:t>
+      </w:r>
+      <w:r>
+        <w:rPr>
+          <w:rFonts w:ascii="Calibri" w:hAnsi="Calibri"/>
+          <w:color w:val="334155"/>
+          <w:sz w:val="20"/>
+        </w:rPr>
+        <w:t>Synthesizes structured intelligence summaries with domain governance analysis and target graph topology metrics.</w:t>
+      </w:r>
+    </w:p>
+    <w:p>
       <w:r>
         <w:br w:type="page"/>
       </w:r>
@@ -4343,7 +4585,77 @@
           <w:color w:val="4F46E5"/>
           <w:sz w:val="28"/>
         </w:rPr>
-        <w:t>Step 8: Exploring in Graphical Ontology &amp; Mapping Modes</w:t>
+        <w:t>Step 8: Executing Data Movement Pipeline</w:t>
+      </w:r>
+    </w:p>
+    <w:p>
+      <w:pPr>
+        <w:spacing w:before="0" w:after="120" w:line="276" w:lineRule="auto"/>
+      </w:pPr>
+      <w:r>
+        <w:rPr>
+          <w:rFonts w:ascii="Calibri" w:hAnsi="Calibri"/>
+          <w:i w:val="0"/>
+          <w:color w:val="334155"/>
+          <w:sz w:val="21"/>
+        </w:rPr>
+        <w:t>1. Navigate to '⚡ Data Movement Engine'.</w:t>
+        <w:br/>
+        <w:t>2. Select the source connector, migration mode (Full Refresh or Incremental), and batch size.</w:t>
+        <w:br/>
+        <w:t>3. Click '⚡ Launch Data Movement Pipeline' to stream relational data into the Target Knowledge Graph.</w:t>
+        <w:br/>
+        <w:t>4. Monitor the live 6-stage stepper, view real-time terminal output, and review audit history logs.</w:t>
+      </w:r>
+    </w:p>
+    <w:p>
+      <w:pPr>
+        <w:keepNext/>
+        <w:spacing w:before="280" w:after="120"/>
+      </w:pPr>
+      <w:r>
+        <w:rPr>
+          <w:rFonts w:ascii="Calibri" w:hAnsi="Calibri"/>
+          <w:b/>
+          <w:color w:val="4F46E5"/>
+          <w:sz w:val="28"/>
+        </w:rPr>
+        <w:t>Step 9: Generating AI Graph Insights</w:t>
+      </w:r>
+    </w:p>
+    <w:p>
+      <w:pPr>
+        <w:spacing w:before="0" w:after="120" w:line="276" w:lineRule="auto"/>
+      </w:pPr>
+      <w:r>
+        <w:rPr>
+          <w:rFonts w:ascii="Calibri" w:hAnsi="Calibri"/>
+          <w:i w:val="0"/>
+          <w:color w:val="334155"/>
+          <w:sz w:val="21"/>
+        </w:rPr>
+        <w:t>1. Navigate to '💡 AI Graph Insights'.</w:t>
+        <w:br/>
+        <w:t>2. Select a dynamic prompt pill (e.g. ':Vendor', ':Invoice') or type a custom question.</w:t>
+        <w:br/>
+        <w:t>3. Click '⚡ Generate AI Insights' to synthesize Cypher queries and analyze live data records.</w:t>
+        <w:br/>
+        <w:t>4. Review executive intelligence summaries, domain governance findings, and Cypher execution results.</w:t>
+      </w:r>
+    </w:p>
+    <w:p>
+      <w:pPr>
+        <w:keepNext/>
+        <w:spacing w:before="280" w:after="120"/>
+      </w:pPr>
+      <w:r>
+        <w:rPr>
+          <w:rFonts w:ascii="Calibri" w:hAnsi="Calibri"/>
+          <w:b/>
+          <w:color w:val="4F46E5"/>
+          <w:sz w:val="28"/>
+        </w:rPr>
+        <w:t>Step 10: Exploring in Graphical Ontology &amp; Mapping Modes</w:t>
       </w:r>
     </w:p>
     <w:p>
@@ -4378,7 +4690,7 @@
           <w:color w:val="4F46E5"/>
           <w:sz w:val="28"/>
         </w:rPr>
-        <w:t>Step 9: Utilizing the Stateless Upload &amp; Sandbox Viewer</w:t>
+        <w:t>Step 11: Utilizing the Stateless Upload &amp; Sandbox Viewer</w:t>
       </w:r>
     </w:p>
     <w:p>
@@ -4413,7 +4725,7 @@
           <w:color w:val="4F46E5"/>
           <w:sz w:val="28"/>
         </w:rPr>
-        <w:t>Step 10: Exporting Artifacts &amp; Syncing with Target Graph</w:t>
+        <w:t>Step 12: Exporting Artifacts &amp; Syncing with Target Graph</w:t>
       </w:r>
     </w:p>
     <w:p>
@@ -4492,7 +4804,7 @@
       <w:tr>
         <w:tc>
           <w:tcPr>
-            <w:tcW w:type="dxa" w:w="1296"/>
+            <w:tcW w:type="dxa" w:w="1152"/>
             <w:shd w:fill="1E293B"/>
             <w:tcMar>
               <w:top w:w="140" w:type="dxa"/>
@@ -4546,7 +4858,7 @@
         </w:tc>
         <w:tc>
           <w:tcPr>
-            <w:tcW w:type="dxa" w:w="1872"/>
+            <w:tcW w:type="dxa" w:w="1728"/>
             <w:shd w:fill="1E293B"/>
             <w:tcMar>
               <w:top w:w="140" w:type="dxa"/>
@@ -4573,7 +4885,7 @@
         </w:tc>
         <w:tc>
           <w:tcPr>
-            <w:tcW w:type="dxa" w:w="2880"/>
+            <w:tcW w:type="dxa" w:w="3168"/>
             <w:shd w:fill="1E293B"/>
             <w:tcMar>
               <w:top w:w="140" w:type="dxa"/>
@@ -4602,7 +4914,7 @@
       <w:tr>
         <w:tc>
           <w:tcPr>
-            <w:tcW w:type="dxa" w:w="1296"/>
+            <w:tcW w:type="dxa" w:w="1152"/>
             <w:shd w:fill="FFFFFF"/>
             <w:tcMar>
               <w:top w:w="100" w:type="dxa"/>
@@ -4654,7 +4966,7 @@
         </w:tc>
         <w:tc>
           <w:tcPr>
-            <w:tcW w:type="dxa" w:w="1872"/>
+            <w:tcW w:type="dxa" w:w="1728"/>
             <w:shd w:fill="FFFFFF"/>
             <w:tcMar>
               <w:top w:w="100" w:type="dxa"/>
@@ -4680,7 +4992,7 @@
         </w:tc>
         <w:tc>
           <w:tcPr>
-            <w:tcW w:type="dxa" w:w="2880"/>
+            <w:tcW w:type="dxa" w:w="3168"/>
             <w:shd w:fill="FFFFFF"/>
             <w:tcMar>
               <w:top w:w="100" w:type="dxa"/>
@@ -4708,7 +5020,7 @@
       <w:tr>
         <w:tc>
           <w:tcPr>
-            <w:tcW w:type="dxa" w:w="1296"/>
+            <w:tcW w:type="dxa" w:w="1152"/>
             <w:shd w:fill="F8FAFC"/>
             <w:tcMar>
               <w:top w:w="100" w:type="dxa"/>
@@ -4760,7 +5072,7 @@
         </w:tc>
         <w:tc>
           <w:tcPr>
-            <w:tcW w:type="dxa" w:w="1872"/>
+            <w:tcW w:type="dxa" w:w="1728"/>
             <w:shd w:fill="F8FAFC"/>
             <w:tcMar>
               <w:top w:w="100" w:type="dxa"/>
@@ -4786,7 +5098,7 @@
         </w:tc>
         <w:tc>
           <w:tcPr>
-            <w:tcW w:type="dxa" w:w="2880"/>
+            <w:tcW w:type="dxa" w:w="3168"/>
             <w:shd w:fill="F8FAFC"/>
             <w:tcMar>
               <w:top w:w="100" w:type="dxa"/>
@@ -4814,7 +5126,7 @@
       <w:tr>
         <w:tc>
           <w:tcPr>
-            <w:tcW w:type="dxa" w:w="1296"/>
+            <w:tcW w:type="dxa" w:w="1152"/>
             <w:shd w:fill="FFFFFF"/>
             <w:tcMar>
               <w:top w:w="100" w:type="dxa"/>
@@ -4866,7 +5178,7 @@
         </w:tc>
         <w:tc>
           <w:tcPr>
-            <w:tcW w:type="dxa" w:w="1872"/>
+            <w:tcW w:type="dxa" w:w="1728"/>
             <w:shd w:fill="FFFFFF"/>
             <w:tcMar>
               <w:top w:w="100" w:type="dxa"/>
@@ -4892,7 +5204,7 @@
         </w:tc>
         <w:tc>
           <w:tcPr>
-            <w:tcW w:type="dxa" w:w="2880"/>
+            <w:tcW w:type="dxa" w:w="3168"/>
             <w:shd w:fill="FFFFFF"/>
             <w:tcMar>
               <w:top w:w="100" w:type="dxa"/>
@@ -4920,7 +5232,7 @@
       <w:tr>
         <w:tc>
           <w:tcPr>
-            <w:tcW w:type="dxa" w:w="1296"/>
+            <w:tcW w:type="dxa" w:w="1152"/>
             <w:shd w:fill="F8FAFC"/>
             <w:tcMar>
               <w:top w:w="100" w:type="dxa"/>
@@ -4972,7 +5284,7 @@
         </w:tc>
         <w:tc>
           <w:tcPr>
-            <w:tcW w:type="dxa" w:w="1872"/>
+            <w:tcW w:type="dxa" w:w="1728"/>
             <w:shd w:fill="F8FAFC"/>
             <w:tcMar>
               <w:top w:w="100" w:type="dxa"/>
@@ -4998,7 +5310,7 @@
         </w:tc>
         <w:tc>
           <w:tcPr>
-            <w:tcW w:type="dxa" w:w="2880"/>
+            <w:tcW w:type="dxa" w:w="3168"/>
             <w:shd w:fill="F8FAFC"/>
             <w:tcMar>
               <w:top w:w="100" w:type="dxa"/>
@@ -5026,7 +5338,7 @@
       <w:tr>
         <w:tc>
           <w:tcPr>
-            <w:tcW w:type="dxa" w:w="1296"/>
+            <w:tcW w:type="dxa" w:w="1152"/>
             <w:shd w:fill="FFFFFF"/>
             <w:tcMar>
               <w:top w:w="100" w:type="dxa"/>
@@ -5078,7 +5390,7 @@
         </w:tc>
         <w:tc>
           <w:tcPr>
-            <w:tcW w:type="dxa" w:w="1872"/>
+            <w:tcW w:type="dxa" w:w="1728"/>
             <w:shd w:fill="FFFFFF"/>
             <w:tcMar>
               <w:top w:w="100" w:type="dxa"/>
@@ -5104,7 +5416,7 @@
         </w:tc>
         <w:tc>
           <w:tcPr>
-            <w:tcW w:type="dxa" w:w="2880"/>
+            <w:tcW w:type="dxa" w:w="3168"/>
             <w:shd w:fill="FFFFFF"/>
             <w:tcMar>
               <w:top w:w="100" w:type="dxa"/>
@@ -5132,7 +5444,7 @@
       <w:tr>
         <w:tc>
           <w:tcPr>
-            <w:tcW w:type="dxa" w:w="1296"/>
+            <w:tcW w:type="dxa" w:w="1152"/>
             <w:shd w:fill="F8FAFC"/>
             <w:tcMar>
               <w:top w:w="100" w:type="dxa"/>
@@ -5184,7 +5496,7 @@
         </w:tc>
         <w:tc>
           <w:tcPr>
-            <w:tcW w:type="dxa" w:w="1872"/>
+            <w:tcW w:type="dxa" w:w="1728"/>
             <w:shd w:fill="F8FAFC"/>
             <w:tcMar>
               <w:top w:w="100" w:type="dxa"/>
@@ -5210,7 +5522,7 @@
         </w:tc>
         <w:tc>
           <w:tcPr>
-            <w:tcW w:type="dxa" w:w="2880"/>
+            <w:tcW w:type="dxa" w:w="3168"/>
             <w:shd w:fill="F8FAFC"/>
             <w:tcMar>
               <w:top w:w="100" w:type="dxa"/>
@@ -5238,7 +5550,7 @@
       <w:tr>
         <w:tc>
           <w:tcPr>
-            <w:tcW w:type="dxa" w:w="1296"/>
+            <w:tcW w:type="dxa" w:w="1152"/>
             <w:shd w:fill="FFFFFF"/>
             <w:tcMar>
               <w:top w:w="100" w:type="dxa"/>
@@ -5290,7 +5602,7 @@
         </w:tc>
         <w:tc>
           <w:tcPr>
-            <w:tcW w:type="dxa" w:w="1872"/>
+            <w:tcW w:type="dxa" w:w="1728"/>
             <w:shd w:fill="FFFFFF"/>
             <w:tcMar>
               <w:top w:w="100" w:type="dxa"/>
@@ -5316,7 +5628,7 @@
         </w:tc>
         <w:tc>
           <w:tcPr>
-            <w:tcW w:type="dxa" w:w="2880"/>
+            <w:tcW w:type="dxa" w:w="3168"/>
             <w:shd w:fill="FFFFFF"/>
             <w:tcMar>
               <w:top w:w="100" w:type="dxa"/>
@@ -5344,7 +5656,7 @@
       <w:tr>
         <w:tc>
           <w:tcPr>
-            <w:tcW w:type="dxa" w:w="1296"/>
+            <w:tcW w:type="dxa" w:w="1152"/>
             <w:shd w:fill="F8FAFC"/>
             <w:tcMar>
               <w:top w:w="100" w:type="dxa"/>
@@ -5396,7 +5708,7 @@
         </w:tc>
         <w:tc>
           <w:tcPr>
-            <w:tcW w:type="dxa" w:w="1872"/>
+            <w:tcW w:type="dxa" w:w="1728"/>
             <w:shd w:fill="F8FAFC"/>
             <w:tcMar>
               <w:top w:w="100" w:type="dxa"/>
@@ -5422,7 +5734,7 @@
         </w:tc>
         <w:tc>
           <w:tcPr>
-            <w:tcW w:type="dxa" w:w="2880"/>
+            <w:tcW w:type="dxa" w:w="3168"/>
             <w:shd w:fill="F8FAFC"/>
             <w:tcMar>
               <w:top w:w="100" w:type="dxa"/>
@@ -5450,7 +5762,7 @@
       <w:tr>
         <w:tc>
           <w:tcPr>
-            <w:tcW w:type="dxa" w:w="1296"/>
+            <w:tcW w:type="dxa" w:w="1152"/>
             <w:shd w:fill="FFFFFF"/>
             <w:tcMar>
               <w:top w:w="100" w:type="dxa"/>
@@ -5502,7 +5814,7 @@
         </w:tc>
         <w:tc>
           <w:tcPr>
-            <w:tcW w:type="dxa" w:w="1872"/>
+            <w:tcW w:type="dxa" w:w="1728"/>
             <w:shd w:fill="FFFFFF"/>
             <w:tcMar>
               <w:top w:w="100" w:type="dxa"/>
@@ -5528,7 +5840,7 @@
         </w:tc>
         <w:tc>
           <w:tcPr>
-            <w:tcW w:type="dxa" w:w="2880"/>
+            <w:tcW w:type="dxa" w:w="3168"/>
             <w:shd w:fill="FFFFFF"/>
             <w:tcMar>
               <w:top w:w="100" w:type="dxa"/>
@@ -5556,7 +5868,7 @@
       <w:tr>
         <w:tc>
           <w:tcPr>
-            <w:tcW w:type="dxa" w:w="1296"/>
+            <w:tcW w:type="dxa" w:w="1152"/>
             <w:shd w:fill="F8FAFC"/>
             <w:tcMar>
               <w:top w:w="100" w:type="dxa"/>
@@ -5608,7 +5920,7 @@
         </w:tc>
         <w:tc>
           <w:tcPr>
-            <w:tcW w:type="dxa" w:w="1872"/>
+            <w:tcW w:type="dxa" w:w="1728"/>
             <w:shd w:fill="F8FAFC"/>
             <w:tcMar>
               <w:top w:w="100" w:type="dxa"/>
@@ -5634,7 +5946,7 @@
         </w:tc>
         <w:tc>
           <w:tcPr>
-            <w:tcW w:type="dxa" w:w="2880"/>
+            <w:tcW w:type="dxa" w:w="3168"/>
             <w:shd w:fill="F8FAFC"/>
             <w:tcMar>
               <w:top w:w="100" w:type="dxa"/>
@@ -5662,7 +5974,7 @@
       <w:tr>
         <w:tc>
           <w:tcPr>
-            <w:tcW w:type="dxa" w:w="1296"/>
+            <w:tcW w:type="dxa" w:w="1152"/>
             <w:shd w:fill="FFFFFF"/>
             <w:tcMar>
               <w:top w:w="100" w:type="dxa"/>
@@ -5714,7 +6026,7 @@
         </w:tc>
         <w:tc>
           <w:tcPr>
-            <w:tcW w:type="dxa" w:w="1872"/>
+            <w:tcW w:type="dxa" w:w="1728"/>
             <w:shd w:fill="FFFFFF"/>
             <w:tcMar>
               <w:top w:w="100" w:type="dxa"/>
@@ -5740,7 +6052,7 @@
         </w:tc>
         <w:tc>
           <w:tcPr>
-            <w:tcW w:type="dxa" w:w="2880"/>
+            <w:tcW w:type="dxa" w:w="3168"/>
             <w:shd w:fill="FFFFFF"/>
             <w:tcMar>
               <w:top w:w="100" w:type="dxa"/>
@@ -5768,7 +6080,7 @@
       <w:tr>
         <w:tc>
           <w:tcPr>
-            <w:tcW w:type="dxa" w:w="1296"/>
+            <w:tcW w:type="dxa" w:w="1152"/>
             <w:shd w:fill="F8FAFC"/>
             <w:tcMar>
               <w:top w:w="100" w:type="dxa"/>
@@ -5820,7 +6132,7 @@
         </w:tc>
         <w:tc>
           <w:tcPr>
-            <w:tcW w:type="dxa" w:w="1872"/>
+            <w:tcW w:type="dxa" w:w="1728"/>
             <w:shd w:fill="F8FAFC"/>
             <w:tcMar>
               <w:top w:w="100" w:type="dxa"/>
@@ -5846,7 +6158,7 @@
         </w:tc>
         <w:tc>
           <w:tcPr>
-            <w:tcW w:type="dxa" w:w="2880"/>
+            <w:tcW w:type="dxa" w:w="3168"/>
             <w:shd w:fill="F8FAFC"/>
             <w:tcMar>
               <w:top w:w="100" w:type="dxa"/>
@@ -5874,7 +6186,7 @@
       <w:tr>
         <w:tc>
           <w:tcPr>
-            <w:tcW w:type="dxa" w:w="1296"/>
+            <w:tcW w:type="dxa" w:w="1152"/>
             <w:shd w:fill="FFFFFF"/>
             <w:tcMar>
               <w:top w:w="100" w:type="dxa"/>
@@ -5926,7 +6238,7 @@
         </w:tc>
         <w:tc>
           <w:tcPr>
-            <w:tcW w:type="dxa" w:w="1872"/>
+            <w:tcW w:type="dxa" w:w="1728"/>
             <w:shd w:fill="FFFFFF"/>
             <w:tcMar>
               <w:top w:w="100" w:type="dxa"/>
@@ -5952,7 +6264,7 @@
         </w:tc>
         <w:tc>
           <w:tcPr>
-            <w:tcW w:type="dxa" w:w="2880"/>
+            <w:tcW w:type="dxa" w:w="3168"/>
             <w:shd w:fill="FFFFFF"/>
             <w:tcMar>
               <w:top w:w="100" w:type="dxa"/>
@@ -5980,7 +6292,7 @@
       <w:tr>
         <w:tc>
           <w:tcPr>
-            <w:tcW w:type="dxa" w:w="1296"/>
+            <w:tcW w:type="dxa" w:w="1152"/>
             <w:shd w:fill="F8FAFC"/>
             <w:tcMar>
               <w:top w:w="100" w:type="dxa"/>
@@ -6032,7 +6344,7 @@
         </w:tc>
         <w:tc>
           <w:tcPr>
-            <w:tcW w:type="dxa" w:w="1872"/>
+            <w:tcW w:type="dxa" w:w="1728"/>
             <w:shd w:fill="F8FAFC"/>
             <w:tcMar>
               <w:top w:w="100" w:type="dxa"/>
@@ -6058,7 +6370,7 @@
         </w:tc>
         <w:tc>
           <w:tcPr>
-            <w:tcW w:type="dxa" w:w="2880"/>
+            <w:tcW w:type="dxa" w:w="3168"/>
             <w:shd w:fill="F8FAFC"/>
             <w:tcMar>
               <w:top w:w="100" w:type="dxa"/>
@@ -6086,7 +6398,7 @@
       <w:tr>
         <w:tc>
           <w:tcPr>
-            <w:tcW w:type="dxa" w:w="1296"/>
+            <w:tcW w:type="dxa" w:w="1152"/>
             <w:shd w:fill="FFFFFF"/>
             <w:tcMar>
               <w:top w:w="100" w:type="dxa"/>
@@ -6138,7 +6450,7 @@
         </w:tc>
         <w:tc>
           <w:tcPr>
-            <w:tcW w:type="dxa" w:w="1872"/>
+            <w:tcW w:type="dxa" w:w="1728"/>
             <w:shd w:fill="FFFFFF"/>
             <w:tcMar>
               <w:top w:w="100" w:type="dxa"/>
@@ -6164,7 +6476,7 @@
         </w:tc>
         <w:tc>
           <w:tcPr>
-            <w:tcW w:type="dxa" w:w="2880"/>
+            <w:tcW w:type="dxa" w:w="3168"/>
             <w:shd w:fill="FFFFFF"/>
             <w:tcMar>
               <w:top w:w="100" w:type="dxa"/>
@@ -6192,7 +6504,7 @@
       <w:tr>
         <w:tc>
           <w:tcPr>
-            <w:tcW w:type="dxa" w:w="1296"/>
+            <w:tcW w:type="dxa" w:w="1152"/>
             <w:shd w:fill="F8FAFC"/>
             <w:tcMar>
               <w:top w:w="100" w:type="dxa"/>
@@ -6244,7 +6556,7 @@
         </w:tc>
         <w:tc>
           <w:tcPr>
-            <w:tcW w:type="dxa" w:w="1872"/>
+            <w:tcW w:type="dxa" w:w="1728"/>
             <w:shd w:fill="F8FAFC"/>
             <w:tcMar>
               <w:top w:w="100" w:type="dxa"/>
@@ -6270,7 +6582,7 @@
         </w:tc>
         <w:tc>
           <w:tcPr>
-            <w:tcW w:type="dxa" w:w="2880"/>
+            <w:tcW w:type="dxa" w:w="3168"/>
             <w:shd w:fill="F8FAFC"/>
             <w:tcMar>
               <w:top w:w="100" w:type="dxa"/>
@@ -6298,7 +6610,7 @@
       <w:tr>
         <w:tc>
           <w:tcPr>
-            <w:tcW w:type="dxa" w:w="1296"/>
+            <w:tcW w:type="dxa" w:w="1152"/>
             <w:shd w:fill="FFFFFF"/>
             <w:tcMar>
               <w:top w:w="100" w:type="dxa"/>
@@ -6350,7 +6662,7 @@
         </w:tc>
         <w:tc>
           <w:tcPr>
-            <w:tcW w:type="dxa" w:w="1872"/>
+            <w:tcW w:type="dxa" w:w="1728"/>
             <w:shd w:fill="FFFFFF"/>
             <w:tcMar>
               <w:top w:w="100" w:type="dxa"/>
@@ -6376,7 +6688,7 @@
         </w:tc>
         <w:tc>
           <w:tcPr>
-            <w:tcW w:type="dxa" w:w="2880"/>
+            <w:tcW w:type="dxa" w:w="3168"/>
             <w:shd w:fill="FFFFFF"/>
             <w:tcMar>
               <w:top w:w="100" w:type="dxa"/>
@@ -6404,7 +6716,7 @@
       <w:tr>
         <w:tc>
           <w:tcPr>
-            <w:tcW w:type="dxa" w:w="1296"/>
+            <w:tcW w:type="dxa" w:w="1152"/>
             <w:shd w:fill="F8FAFC"/>
             <w:tcMar>
               <w:top w:w="100" w:type="dxa"/>
@@ -6456,7 +6768,7 @@
         </w:tc>
         <w:tc>
           <w:tcPr>
-            <w:tcW w:type="dxa" w:w="1872"/>
+            <w:tcW w:type="dxa" w:w="1728"/>
             <w:shd w:fill="F8FAFC"/>
             <w:tcMar>
               <w:top w:w="100" w:type="dxa"/>
@@ -6482,7 +6794,7 @@
         </w:tc>
         <w:tc>
           <w:tcPr>
-            <w:tcW w:type="dxa" w:w="2880"/>
+            <w:tcW w:type="dxa" w:w="3168"/>
             <w:shd w:fill="F8FAFC"/>
             <w:tcMar>
               <w:top w:w="100" w:type="dxa"/>
@@ -6510,7 +6822,7 @@
       <w:tr>
         <w:tc>
           <w:tcPr>
-            <w:tcW w:type="dxa" w:w="1296"/>
+            <w:tcW w:type="dxa" w:w="1152"/>
             <w:shd w:fill="FFFFFF"/>
             <w:tcMar>
               <w:top w:w="100" w:type="dxa"/>
@@ -6562,7 +6874,7 @@
         </w:tc>
         <w:tc>
           <w:tcPr>
-            <w:tcW w:type="dxa" w:w="1872"/>
+            <w:tcW w:type="dxa" w:w="1728"/>
             <w:shd w:fill="FFFFFF"/>
             <w:tcMar>
               <w:top w:w="100" w:type="dxa"/>
@@ -6588,7 +6900,7 @@
         </w:tc>
         <w:tc>
           <w:tcPr>
-            <w:tcW w:type="dxa" w:w="2880"/>
+            <w:tcW w:type="dxa" w:w="3168"/>
             <w:shd w:fill="FFFFFF"/>
             <w:tcMar>
               <w:top w:w="100" w:type="dxa"/>
@@ -6616,7 +6928,7 @@
       <w:tr>
         <w:tc>
           <w:tcPr>
-            <w:tcW w:type="dxa" w:w="1296"/>
+            <w:tcW w:type="dxa" w:w="1152"/>
             <w:shd w:fill="F8FAFC"/>
             <w:tcMar>
               <w:top w:w="100" w:type="dxa"/>
@@ -6668,7 +6980,7 @@
         </w:tc>
         <w:tc>
           <w:tcPr>
-            <w:tcW w:type="dxa" w:w="1872"/>
+            <w:tcW w:type="dxa" w:w="1728"/>
             <w:shd w:fill="F8FAFC"/>
             <w:tcMar>
               <w:top w:w="100" w:type="dxa"/>
@@ -6694,7 +7006,7 @@
         </w:tc>
         <w:tc>
           <w:tcPr>
-            <w:tcW w:type="dxa" w:w="2880"/>
+            <w:tcW w:type="dxa" w:w="3168"/>
             <w:shd w:fill="F8FAFC"/>
             <w:tcMar>
               <w:top w:w="100" w:type="dxa"/>
@@ -6722,7 +7034,855 @@
       <w:tr>
         <w:tc>
           <w:tcPr>
-            <w:tcW w:type="dxa" w:w="1296"/>
+            <w:tcW w:type="dxa" w:w="1152"/>
+            <w:shd w:fill="FFFFFF"/>
+            <w:tcMar>
+              <w:top w:w="100" w:type="dxa"/>
+              <w:bottom w:w="100" w:type="dxa"/>
+              <w:left w:w="140" w:type="dxa"/>
+              <w:right w:w="140" w:type="dxa"/>
+            </w:tcMar>
+            <w:vAlign w:val="center"/>
+          </w:tcPr>
+          <w:p>
+            <w:pPr>
+              <w:spacing w:before="0" w:after="0"/>
+            </w:pPr>
+            <w:r>
+              <w:rPr>
+                <w:rFonts w:ascii="Calibri" w:hAnsi="Calibri"/>
+                <w:color w:val="334155"/>
+                <w:sz w:val="18"/>
+              </w:rPr>
+              <w:t>GET</w:t>
+            </w:r>
+          </w:p>
+        </w:tc>
+        <w:tc>
+          <w:tcPr>
+            <w:tcW w:type="dxa" w:w="3312"/>
+            <w:shd w:fill="FFFFFF"/>
+            <w:tcMar>
+              <w:top w:w="100" w:type="dxa"/>
+              <w:bottom w:w="100" w:type="dxa"/>
+              <w:left w:w="140" w:type="dxa"/>
+              <w:right w:w="140" w:type="dxa"/>
+            </w:tcMar>
+            <w:vAlign w:val="center"/>
+          </w:tcPr>
+          <w:p>
+            <w:pPr>
+              <w:spacing w:before="0" w:after="0"/>
+            </w:pPr>
+            <w:r>
+              <w:rPr>
+                <w:rFonts w:ascii="Calibri" w:hAnsi="Calibri"/>
+                <w:color w:val="334155"/>
+                <w:sz w:val="18"/>
+              </w:rPr>
+              <w:t>/api/v1/projects/{id}/data-movement/mapping</w:t>
+            </w:r>
+          </w:p>
+        </w:tc>
+        <w:tc>
+          <w:tcPr>
+            <w:tcW w:type="dxa" w:w="1728"/>
+            <w:shd w:fill="FFFFFF"/>
+            <w:tcMar>
+              <w:top w:w="100" w:type="dxa"/>
+              <w:bottom w:w="100" w:type="dxa"/>
+              <w:left w:w="140" w:type="dxa"/>
+              <w:right w:w="140" w:type="dxa"/>
+            </w:tcMar>
+            <w:vAlign w:val="center"/>
+          </w:tcPr>
+          <w:p>
+            <w:pPr>
+              <w:spacing w:before="0" w:after="0"/>
+            </w:pPr>
+            <w:r>
+              <w:rPr>
+                <w:rFonts w:ascii="Calibri" w:hAnsi="Calibri"/>
+                <w:color w:val="334155"/>
+                <w:sz w:val="18"/>
+              </w:rPr>
+              <w:t>Data Movement</w:t>
+            </w:r>
+          </w:p>
+        </w:tc>
+        <w:tc>
+          <w:tcPr>
+            <w:tcW w:type="dxa" w:w="3168"/>
+            <w:shd w:fill="FFFFFF"/>
+            <w:tcMar>
+              <w:top w:w="100" w:type="dxa"/>
+              <w:bottom w:w="100" w:type="dxa"/>
+              <w:left w:w="140" w:type="dxa"/>
+              <w:right w:w="140" w:type="dxa"/>
+            </w:tcMar>
+            <w:vAlign w:val="center"/>
+          </w:tcPr>
+          <w:p>
+            <w:pPr>
+              <w:spacing w:before="0" w:after="0"/>
+            </w:pPr>
+            <w:r>
+              <w:rPr>
+                <w:rFonts w:ascii="Calibri" w:hAnsi="Calibri"/>
+                <w:color w:val="334155"/>
+                <w:sz w:val="18"/>
+              </w:rPr>
+              <w:t>Retrieves table-to-class data movement topology</w:t>
+            </w:r>
+          </w:p>
+        </w:tc>
+      </w:tr>
+      <w:tr>
+        <w:tc>
+          <w:tcPr>
+            <w:tcW w:type="dxa" w:w="1152"/>
+            <w:shd w:fill="F8FAFC"/>
+            <w:tcMar>
+              <w:top w:w="100" w:type="dxa"/>
+              <w:bottom w:w="100" w:type="dxa"/>
+              <w:left w:w="140" w:type="dxa"/>
+              <w:right w:w="140" w:type="dxa"/>
+            </w:tcMar>
+            <w:vAlign w:val="center"/>
+          </w:tcPr>
+          <w:p>
+            <w:pPr>
+              <w:spacing w:before="0" w:after="0"/>
+            </w:pPr>
+            <w:r>
+              <w:rPr>
+                <w:rFonts w:ascii="Calibri" w:hAnsi="Calibri"/>
+                <w:color w:val="334155"/>
+                <w:sz w:val="18"/>
+              </w:rPr>
+              <w:t>POST</w:t>
+            </w:r>
+          </w:p>
+        </w:tc>
+        <w:tc>
+          <w:tcPr>
+            <w:tcW w:type="dxa" w:w="3312"/>
+            <w:shd w:fill="F8FAFC"/>
+            <w:tcMar>
+              <w:top w:w="100" w:type="dxa"/>
+              <w:bottom w:w="100" w:type="dxa"/>
+              <w:left w:w="140" w:type="dxa"/>
+              <w:right w:w="140" w:type="dxa"/>
+            </w:tcMar>
+            <w:vAlign w:val="center"/>
+          </w:tcPr>
+          <w:p>
+            <w:pPr>
+              <w:spacing w:before="0" w:after="0"/>
+            </w:pPr>
+            <w:r>
+              <w:rPr>
+                <w:rFonts w:ascii="Calibri" w:hAnsi="Calibri"/>
+                <w:color w:val="334155"/>
+                <w:sz w:val="18"/>
+              </w:rPr>
+              <w:t>/api/v1/projects/{id}/data-movement/execute</w:t>
+            </w:r>
+          </w:p>
+        </w:tc>
+        <w:tc>
+          <w:tcPr>
+            <w:tcW w:type="dxa" w:w="1728"/>
+            <w:shd w:fill="F8FAFC"/>
+            <w:tcMar>
+              <w:top w:w="100" w:type="dxa"/>
+              <w:bottom w:w="100" w:type="dxa"/>
+              <w:left w:w="140" w:type="dxa"/>
+              <w:right w:w="140" w:type="dxa"/>
+            </w:tcMar>
+            <w:vAlign w:val="center"/>
+          </w:tcPr>
+          <w:p>
+            <w:pPr>
+              <w:spacing w:before="0" w:after="0"/>
+            </w:pPr>
+            <w:r>
+              <w:rPr>
+                <w:rFonts w:ascii="Calibri" w:hAnsi="Calibri"/>
+                <w:color w:val="334155"/>
+                <w:sz w:val="18"/>
+              </w:rPr>
+              <w:t>Data Movement</w:t>
+            </w:r>
+          </w:p>
+        </w:tc>
+        <w:tc>
+          <w:tcPr>
+            <w:tcW w:type="dxa" w:w="3168"/>
+            <w:shd w:fill="F8FAFC"/>
+            <w:tcMar>
+              <w:top w:w="100" w:type="dxa"/>
+              <w:bottom w:w="100" w:type="dxa"/>
+              <w:left w:w="140" w:type="dxa"/>
+              <w:right w:w="140" w:type="dxa"/>
+            </w:tcMar>
+            <w:vAlign w:val="center"/>
+          </w:tcPr>
+          <w:p>
+            <w:pPr>
+              <w:spacing w:before="0" w:after="0"/>
+            </w:pPr>
+            <w:r>
+              <w:rPr>
+                <w:rFonts w:ascii="Calibri" w:hAnsi="Calibri"/>
+                <w:color w:val="334155"/>
+                <w:sz w:val="18"/>
+              </w:rPr>
+              <w:t>Executes data movement pipeline and returns metrics</w:t>
+            </w:r>
+          </w:p>
+        </w:tc>
+      </w:tr>
+      <w:tr>
+        <w:tc>
+          <w:tcPr>
+            <w:tcW w:type="dxa" w:w="1152"/>
+            <w:shd w:fill="FFFFFF"/>
+            <w:tcMar>
+              <w:top w:w="100" w:type="dxa"/>
+              <w:bottom w:w="100" w:type="dxa"/>
+              <w:left w:w="140" w:type="dxa"/>
+              <w:right w:w="140" w:type="dxa"/>
+            </w:tcMar>
+            <w:vAlign w:val="center"/>
+          </w:tcPr>
+          <w:p>
+            <w:pPr>
+              <w:spacing w:before="0" w:after="0"/>
+            </w:pPr>
+            <w:r>
+              <w:rPr>
+                <w:rFonts w:ascii="Calibri" w:hAnsi="Calibri"/>
+                <w:color w:val="334155"/>
+                <w:sz w:val="18"/>
+              </w:rPr>
+              <w:t>GET</w:t>
+            </w:r>
+          </w:p>
+        </w:tc>
+        <w:tc>
+          <w:tcPr>
+            <w:tcW w:type="dxa" w:w="3312"/>
+            <w:shd w:fill="FFFFFF"/>
+            <w:tcMar>
+              <w:top w:w="100" w:type="dxa"/>
+              <w:bottom w:w="100" w:type="dxa"/>
+              <w:left w:w="140" w:type="dxa"/>
+              <w:right w:w="140" w:type="dxa"/>
+            </w:tcMar>
+            <w:vAlign w:val="center"/>
+          </w:tcPr>
+          <w:p>
+            <w:pPr>
+              <w:spacing w:before="0" w:after="0"/>
+            </w:pPr>
+            <w:r>
+              <w:rPr>
+                <w:rFonts w:ascii="Calibri" w:hAnsi="Calibri"/>
+                <w:color w:val="334155"/>
+                <w:sz w:val="18"/>
+              </w:rPr>
+              <w:t>/api/v1/projects/{id}/data-movement/history</w:t>
+            </w:r>
+          </w:p>
+        </w:tc>
+        <w:tc>
+          <w:tcPr>
+            <w:tcW w:type="dxa" w:w="1728"/>
+            <w:shd w:fill="FFFFFF"/>
+            <w:tcMar>
+              <w:top w:w="100" w:type="dxa"/>
+              <w:bottom w:w="100" w:type="dxa"/>
+              <w:left w:w="140" w:type="dxa"/>
+              <w:right w:w="140" w:type="dxa"/>
+            </w:tcMar>
+            <w:vAlign w:val="center"/>
+          </w:tcPr>
+          <w:p>
+            <w:pPr>
+              <w:spacing w:before="0" w:after="0"/>
+            </w:pPr>
+            <w:r>
+              <w:rPr>
+                <w:rFonts w:ascii="Calibri" w:hAnsi="Calibri"/>
+                <w:color w:val="334155"/>
+                <w:sz w:val="18"/>
+              </w:rPr>
+              <w:t>Data Movement</w:t>
+            </w:r>
+          </w:p>
+        </w:tc>
+        <w:tc>
+          <w:tcPr>
+            <w:tcW w:type="dxa" w:w="3168"/>
+            <w:shd w:fill="FFFFFF"/>
+            <w:tcMar>
+              <w:top w:w="100" w:type="dxa"/>
+              <w:bottom w:w="100" w:type="dxa"/>
+              <w:left w:w="140" w:type="dxa"/>
+              <w:right w:w="140" w:type="dxa"/>
+            </w:tcMar>
+            <w:vAlign w:val="center"/>
+          </w:tcPr>
+          <w:p>
+            <w:pPr>
+              <w:spacing w:before="0" w:after="0"/>
+            </w:pPr>
+            <w:r>
+              <w:rPr>
+                <w:rFonts w:ascii="Calibri" w:hAnsi="Calibri"/>
+                <w:color w:val="334155"/>
+                <w:sz w:val="18"/>
+              </w:rPr>
+              <w:t>Retrieves historical data movement audit logs</w:t>
+            </w:r>
+          </w:p>
+        </w:tc>
+      </w:tr>
+      <w:tr>
+        <w:tc>
+          <w:tcPr>
+            <w:tcW w:type="dxa" w:w="1152"/>
+            <w:shd w:fill="F8FAFC"/>
+            <w:tcMar>
+              <w:top w:w="100" w:type="dxa"/>
+              <w:bottom w:w="100" w:type="dxa"/>
+              <w:left w:w="140" w:type="dxa"/>
+              <w:right w:w="140" w:type="dxa"/>
+            </w:tcMar>
+            <w:vAlign w:val="center"/>
+          </w:tcPr>
+          <w:p>
+            <w:pPr>
+              <w:spacing w:before="0" w:after="0"/>
+            </w:pPr>
+            <w:r>
+              <w:rPr>
+                <w:rFonts w:ascii="Calibri" w:hAnsi="Calibri"/>
+                <w:color w:val="334155"/>
+                <w:sz w:val="18"/>
+              </w:rPr>
+              <w:t>DELETE</w:t>
+            </w:r>
+          </w:p>
+        </w:tc>
+        <w:tc>
+          <w:tcPr>
+            <w:tcW w:type="dxa" w:w="3312"/>
+            <w:shd w:fill="F8FAFC"/>
+            <w:tcMar>
+              <w:top w:w="100" w:type="dxa"/>
+              <w:bottom w:w="100" w:type="dxa"/>
+              <w:left w:w="140" w:type="dxa"/>
+              <w:right w:w="140" w:type="dxa"/>
+            </w:tcMar>
+            <w:vAlign w:val="center"/>
+          </w:tcPr>
+          <w:p>
+            <w:pPr>
+              <w:spacing w:before="0" w:after="0"/>
+            </w:pPr>
+            <w:r>
+              <w:rPr>
+                <w:rFonts w:ascii="Calibri" w:hAnsi="Calibri"/>
+                <w:color w:val="334155"/>
+                <w:sz w:val="18"/>
+              </w:rPr>
+              <w:t>/api/v1/projects/{id}/data-movement/history/{jid}</w:t>
+            </w:r>
+          </w:p>
+        </w:tc>
+        <w:tc>
+          <w:tcPr>
+            <w:tcW w:type="dxa" w:w="1728"/>
+            <w:shd w:fill="F8FAFC"/>
+            <w:tcMar>
+              <w:top w:w="100" w:type="dxa"/>
+              <w:bottom w:w="100" w:type="dxa"/>
+              <w:left w:w="140" w:type="dxa"/>
+              <w:right w:w="140" w:type="dxa"/>
+            </w:tcMar>
+            <w:vAlign w:val="center"/>
+          </w:tcPr>
+          <w:p>
+            <w:pPr>
+              <w:spacing w:before="0" w:after="0"/>
+            </w:pPr>
+            <w:r>
+              <w:rPr>
+                <w:rFonts w:ascii="Calibri" w:hAnsi="Calibri"/>
+                <w:color w:val="334155"/>
+                <w:sz w:val="18"/>
+              </w:rPr>
+              <w:t>Data Movement</w:t>
+            </w:r>
+          </w:p>
+        </w:tc>
+        <w:tc>
+          <w:tcPr>
+            <w:tcW w:type="dxa" w:w="3168"/>
+            <w:shd w:fill="F8FAFC"/>
+            <w:tcMar>
+              <w:top w:w="100" w:type="dxa"/>
+              <w:bottom w:w="100" w:type="dxa"/>
+              <w:left w:w="140" w:type="dxa"/>
+              <w:right w:w="140" w:type="dxa"/>
+            </w:tcMar>
+            <w:vAlign w:val="center"/>
+          </w:tcPr>
+          <w:p>
+            <w:pPr>
+              <w:spacing w:before="0" w:after="0"/>
+            </w:pPr>
+            <w:r>
+              <w:rPr>
+                <w:rFonts w:ascii="Calibri" w:hAnsi="Calibri"/>
+                <w:color w:val="334155"/>
+                <w:sz w:val="18"/>
+              </w:rPr>
+              <w:t>Deletes single or all execution audit logs</w:t>
+            </w:r>
+          </w:p>
+        </w:tc>
+      </w:tr>
+      <w:tr>
+        <w:tc>
+          <w:tcPr>
+            <w:tcW w:type="dxa" w:w="1152"/>
+            <w:shd w:fill="FFFFFF"/>
+            <w:tcMar>
+              <w:top w:w="100" w:type="dxa"/>
+              <w:bottom w:w="100" w:type="dxa"/>
+              <w:left w:w="140" w:type="dxa"/>
+              <w:right w:w="140" w:type="dxa"/>
+            </w:tcMar>
+            <w:vAlign w:val="center"/>
+          </w:tcPr>
+          <w:p>
+            <w:pPr>
+              <w:spacing w:before="0" w:after="0"/>
+            </w:pPr>
+            <w:r>
+              <w:rPr>
+                <w:rFonts w:ascii="Calibri" w:hAnsi="Calibri"/>
+                <w:color w:val="334155"/>
+                <w:sz w:val="18"/>
+              </w:rPr>
+              <w:t>POST</w:t>
+            </w:r>
+          </w:p>
+        </w:tc>
+        <w:tc>
+          <w:tcPr>
+            <w:tcW w:type="dxa" w:w="3312"/>
+            <w:shd w:fill="FFFFFF"/>
+            <w:tcMar>
+              <w:top w:w="100" w:type="dxa"/>
+              <w:bottom w:w="100" w:type="dxa"/>
+              <w:left w:w="140" w:type="dxa"/>
+              <w:right w:w="140" w:type="dxa"/>
+            </w:tcMar>
+            <w:vAlign w:val="center"/>
+          </w:tcPr>
+          <w:p>
+            <w:pPr>
+              <w:spacing w:before="0" w:after="0"/>
+            </w:pPr>
+            <w:r>
+              <w:rPr>
+                <w:rFonts w:ascii="Calibri" w:hAnsi="Calibri"/>
+                <w:color w:val="334155"/>
+                <w:sz w:val="18"/>
+              </w:rPr>
+              <w:t>/api/v1/projects/{id}/llm/insights</w:t>
+            </w:r>
+          </w:p>
+        </w:tc>
+        <w:tc>
+          <w:tcPr>
+            <w:tcW w:type="dxa" w:w="1728"/>
+            <w:shd w:fill="FFFFFF"/>
+            <w:tcMar>
+              <w:top w:w="100" w:type="dxa"/>
+              <w:bottom w:w="100" w:type="dxa"/>
+              <w:left w:w="140" w:type="dxa"/>
+              <w:right w:w="140" w:type="dxa"/>
+            </w:tcMar>
+            <w:vAlign w:val="center"/>
+          </w:tcPr>
+          <w:p>
+            <w:pPr>
+              <w:spacing w:before="0" w:after="0"/>
+            </w:pPr>
+            <w:r>
+              <w:rPr>
+                <w:rFonts w:ascii="Calibri" w:hAnsi="Calibri"/>
+                <w:color w:val="334155"/>
+                <w:sz w:val="18"/>
+              </w:rPr>
+              <w:t>AI Insights</w:t>
+            </w:r>
+          </w:p>
+        </w:tc>
+        <w:tc>
+          <w:tcPr>
+            <w:tcW w:type="dxa" w:w="3168"/>
+            <w:shd w:fill="FFFFFF"/>
+            <w:tcMar>
+              <w:top w:w="100" w:type="dxa"/>
+              <w:bottom w:w="100" w:type="dxa"/>
+              <w:left w:w="140" w:type="dxa"/>
+              <w:right w:w="140" w:type="dxa"/>
+            </w:tcMar>
+            <w:vAlign w:val="center"/>
+          </w:tcPr>
+          <w:p>
+            <w:pPr>
+              <w:spacing w:before="0" w:after="0"/>
+            </w:pPr>
+            <w:r>
+              <w:rPr>
+                <w:rFonts w:ascii="Calibri" w:hAnsi="Calibri"/>
+                <w:color w:val="334155"/>
+                <w:sz w:val="18"/>
+              </w:rPr>
+              <w:t>Generates Cypher and executive AI summary for prompt</w:t>
+            </w:r>
+          </w:p>
+        </w:tc>
+      </w:tr>
+      <w:tr>
+        <w:tc>
+          <w:tcPr>
+            <w:tcW w:type="dxa" w:w="1152"/>
+            <w:shd w:fill="F8FAFC"/>
+            <w:tcMar>
+              <w:top w:w="100" w:type="dxa"/>
+              <w:bottom w:w="100" w:type="dxa"/>
+              <w:left w:w="140" w:type="dxa"/>
+              <w:right w:w="140" w:type="dxa"/>
+            </w:tcMar>
+            <w:vAlign w:val="center"/>
+          </w:tcPr>
+          <w:p>
+            <w:pPr>
+              <w:spacing w:before="0" w:after="0"/>
+            </w:pPr>
+            <w:r>
+              <w:rPr>
+                <w:rFonts w:ascii="Calibri" w:hAnsi="Calibri"/>
+                <w:color w:val="334155"/>
+                <w:sz w:val="18"/>
+              </w:rPr>
+              <w:t>GET</w:t>
+            </w:r>
+          </w:p>
+        </w:tc>
+        <w:tc>
+          <w:tcPr>
+            <w:tcW w:type="dxa" w:w="3312"/>
+            <w:shd w:fill="F8FAFC"/>
+            <w:tcMar>
+              <w:top w:w="100" w:type="dxa"/>
+              <w:bottom w:w="100" w:type="dxa"/>
+              <w:left w:w="140" w:type="dxa"/>
+              <w:right w:w="140" w:type="dxa"/>
+            </w:tcMar>
+            <w:vAlign w:val="center"/>
+          </w:tcPr>
+          <w:p>
+            <w:pPr>
+              <w:spacing w:before="0" w:after="0"/>
+            </w:pPr>
+            <w:r>
+              <w:rPr>
+                <w:rFonts w:ascii="Calibri" w:hAnsi="Calibri"/>
+                <w:color w:val="334155"/>
+                <w:sz w:val="18"/>
+              </w:rPr>
+              <w:t>/api/v1/projects/{id}/llm/approved-cyphers</w:t>
+            </w:r>
+          </w:p>
+        </w:tc>
+        <w:tc>
+          <w:tcPr>
+            <w:tcW w:type="dxa" w:w="1728"/>
+            <w:shd w:fill="F8FAFC"/>
+            <w:tcMar>
+              <w:top w:w="100" w:type="dxa"/>
+              <w:bottom w:w="100" w:type="dxa"/>
+              <w:left w:w="140" w:type="dxa"/>
+              <w:right w:w="140" w:type="dxa"/>
+            </w:tcMar>
+            <w:vAlign w:val="center"/>
+          </w:tcPr>
+          <w:p>
+            <w:pPr>
+              <w:spacing w:before="0" w:after="0"/>
+            </w:pPr>
+            <w:r>
+              <w:rPr>
+                <w:rFonts w:ascii="Calibri" w:hAnsi="Calibri"/>
+                <w:color w:val="334155"/>
+                <w:sz w:val="18"/>
+              </w:rPr>
+              <w:t>AI Insights</w:t>
+            </w:r>
+          </w:p>
+        </w:tc>
+        <w:tc>
+          <w:tcPr>
+            <w:tcW w:type="dxa" w:w="3168"/>
+            <w:shd w:fill="F8FAFC"/>
+            <w:tcMar>
+              <w:top w:w="100" w:type="dxa"/>
+              <w:bottom w:w="100" w:type="dxa"/>
+              <w:left w:w="140" w:type="dxa"/>
+              <w:right w:w="140" w:type="dxa"/>
+            </w:tcMar>
+            <w:vAlign w:val="center"/>
+          </w:tcPr>
+          <w:p>
+            <w:pPr>
+              <w:spacing w:before="0" w:after="0"/>
+            </w:pPr>
+            <w:r>
+              <w:rPr>
+                <w:rFonts w:ascii="Calibri" w:hAnsi="Calibri"/>
+                <w:color w:val="334155"/>
+                <w:sz w:val="18"/>
+              </w:rPr>
+              <w:t>Lists approved few-shot Cypher query repository</w:t>
+            </w:r>
+          </w:p>
+        </w:tc>
+      </w:tr>
+      <w:tr>
+        <w:tc>
+          <w:tcPr>
+            <w:tcW w:type="dxa" w:w="1152"/>
+            <w:shd w:fill="FFFFFF"/>
+            <w:tcMar>
+              <w:top w:w="100" w:type="dxa"/>
+              <w:bottom w:w="100" w:type="dxa"/>
+              <w:left w:w="140" w:type="dxa"/>
+              <w:right w:w="140" w:type="dxa"/>
+            </w:tcMar>
+            <w:vAlign w:val="center"/>
+          </w:tcPr>
+          <w:p>
+            <w:pPr>
+              <w:spacing w:before="0" w:after="0"/>
+            </w:pPr>
+            <w:r>
+              <w:rPr>
+                <w:rFonts w:ascii="Calibri" w:hAnsi="Calibri"/>
+                <w:color w:val="334155"/>
+                <w:sz w:val="18"/>
+              </w:rPr>
+              <w:t>POST</w:t>
+            </w:r>
+          </w:p>
+        </w:tc>
+        <w:tc>
+          <w:tcPr>
+            <w:tcW w:type="dxa" w:w="3312"/>
+            <w:shd w:fill="FFFFFF"/>
+            <w:tcMar>
+              <w:top w:w="100" w:type="dxa"/>
+              <w:bottom w:w="100" w:type="dxa"/>
+              <w:left w:w="140" w:type="dxa"/>
+              <w:right w:w="140" w:type="dxa"/>
+            </w:tcMar>
+            <w:vAlign w:val="center"/>
+          </w:tcPr>
+          <w:p>
+            <w:pPr>
+              <w:spacing w:before="0" w:after="0"/>
+            </w:pPr>
+            <w:r>
+              <w:rPr>
+                <w:rFonts w:ascii="Calibri" w:hAnsi="Calibri"/>
+                <w:color w:val="334155"/>
+                <w:sz w:val="18"/>
+              </w:rPr>
+              <w:t>/api/v1/projects/{id}/llm/approved-cyphers</w:t>
+            </w:r>
+          </w:p>
+        </w:tc>
+        <w:tc>
+          <w:tcPr>
+            <w:tcW w:type="dxa" w:w="1728"/>
+            <w:shd w:fill="FFFFFF"/>
+            <w:tcMar>
+              <w:top w:w="100" w:type="dxa"/>
+              <w:bottom w:w="100" w:type="dxa"/>
+              <w:left w:w="140" w:type="dxa"/>
+              <w:right w:w="140" w:type="dxa"/>
+            </w:tcMar>
+            <w:vAlign w:val="center"/>
+          </w:tcPr>
+          <w:p>
+            <w:pPr>
+              <w:spacing w:before="0" w:after="0"/>
+            </w:pPr>
+            <w:r>
+              <w:rPr>
+                <w:rFonts w:ascii="Calibri" w:hAnsi="Calibri"/>
+                <w:color w:val="334155"/>
+                <w:sz w:val="18"/>
+              </w:rPr>
+              <w:t>AI Insights</w:t>
+            </w:r>
+          </w:p>
+        </w:tc>
+        <w:tc>
+          <w:tcPr>
+            <w:tcW w:type="dxa" w:w="3168"/>
+            <w:shd w:fill="FFFFFF"/>
+            <w:tcMar>
+              <w:top w:w="100" w:type="dxa"/>
+              <w:bottom w:w="100" w:type="dxa"/>
+              <w:left w:w="140" w:type="dxa"/>
+              <w:right w:w="140" w:type="dxa"/>
+            </w:tcMar>
+            <w:vAlign w:val="center"/>
+          </w:tcPr>
+          <w:p>
+            <w:pPr>
+              <w:spacing w:before="0" w:after="0"/>
+            </w:pPr>
+            <w:r>
+              <w:rPr>
+                <w:rFonts w:ascii="Calibri" w:hAnsi="Calibri"/>
+                <w:color w:val="334155"/>
+                <w:sz w:val="18"/>
+              </w:rPr>
+              <w:t>Saves approved Cypher query for few-shot learning</w:t>
+            </w:r>
+          </w:p>
+        </w:tc>
+      </w:tr>
+      <w:tr>
+        <w:tc>
+          <w:tcPr>
+            <w:tcW w:type="dxa" w:w="1152"/>
+            <w:shd w:fill="F8FAFC"/>
+            <w:tcMar>
+              <w:top w:w="100" w:type="dxa"/>
+              <w:bottom w:w="100" w:type="dxa"/>
+              <w:left w:w="140" w:type="dxa"/>
+              <w:right w:w="140" w:type="dxa"/>
+            </w:tcMar>
+            <w:vAlign w:val="center"/>
+          </w:tcPr>
+          <w:p>
+            <w:pPr>
+              <w:spacing w:before="0" w:after="0"/>
+            </w:pPr>
+            <w:r>
+              <w:rPr>
+                <w:rFonts w:ascii="Calibri" w:hAnsi="Calibri"/>
+                <w:color w:val="334155"/>
+                <w:sz w:val="18"/>
+              </w:rPr>
+              <w:t>DELETE</w:t>
+            </w:r>
+          </w:p>
+        </w:tc>
+        <w:tc>
+          <w:tcPr>
+            <w:tcW w:type="dxa" w:w="3312"/>
+            <w:shd w:fill="F8FAFC"/>
+            <w:tcMar>
+              <w:top w:w="100" w:type="dxa"/>
+              <w:bottom w:w="100" w:type="dxa"/>
+              <w:left w:w="140" w:type="dxa"/>
+              <w:right w:w="140" w:type="dxa"/>
+            </w:tcMar>
+            <w:vAlign w:val="center"/>
+          </w:tcPr>
+          <w:p>
+            <w:pPr>
+              <w:spacing w:before="0" w:after="0"/>
+            </w:pPr>
+            <w:r>
+              <w:rPr>
+                <w:rFonts w:ascii="Calibri" w:hAnsi="Calibri"/>
+                <w:color w:val="334155"/>
+                <w:sz w:val="18"/>
+              </w:rPr>
+              <w:t>/api/v1/projects/{id}/llm/approved-cyphers/{id}</w:t>
+            </w:r>
+          </w:p>
+        </w:tc>
+        <w:tc>
+          <w:tcPr>
+            <w:tcW w:type="dxa" w:w="1728"/>
+            <w:shd w:fill="F8FAFC"/>
+            <w:tcMar>
+              <w:top w:w="100" w:type="dxa"/>
+              <w:bottom w:w="100" w:type="dxa"/>
+              <w:left w:w="140" w:type="dxa"/>
+              <w:right w:w="140" w:type="dxa"/>
+            </w:tcMar>
+            <w:vAlign w:val="center"/>
+          </w:tcPr>
+          <w:p>
+            <w:pPr>
+              <w:spacing w:before="0" w:after="0"/>
+            </w:pPr>
+            <w:r>
+              <w:rPr>
+                <w:rFonts w:ascii="Calibri" w:hAnsi="Calibri"/>
+                <w:color w:val="334155"/>
+                <w:sz w:val="18"/>
+              </w:rPr>
+              <w:t>AI Insights</w:t>
+            </w:r>
+          </w:p>
+        </w:tc>
+        <w:tc>
+          <w:tcPr>
+            <w:tcW w:type="dxa" w:w="3168"/>
+            <w:shd w:fill="F8FAFC"/>
+            <w:tcMar>
+              <w:top w:w="100" w:type="dxa"/>
+              <w:bottom w:w="100" w:type="dxa"/>
+              <w:left w:w="140" w:type="dxa"/>
+              <w:right w:w="140" w:type="dxa"/>
+            </w:tcMar>
+            <w:vAlign w:val="center"/>
+          </w:tcPr>
+          <w:p>
+            <w:pPr>
+              <w:spacing w:before="0" w:after="0"/>
+            </w:pPr>
+            <w:r>
+              <w:rPr>
+                <w:rFonts w:ascii="Calibri" w:hAnsi="Calibri"/>
+                <w:color w:val="334155"/>
+                <w:sz w:val="18"/>
+              </w:rPr>
+              <w:t>Deletes entry from approved Cypher repository</w:t>
+            </w:r>
+          </w:p>
+        </w:tc>
+      </w:tr>
+      <w:tr>
+        <w:tc>
+          <w:tcPr>
+            <w:tcW w:type="dxa" w:w="1152"/>
             <w:shd w:fill="FFFFFF"/>
             <w:tcMar>
               <w:top w:w="100" w:type="dxa"/>
@@ -6774,7 +7934,7 @@
         </w:tc>
         <w:tc>
           <w:tcPr>
-            <w:tcW w:type="dxa" w:w="1872"/>
+            <w:tcW w:type="dxa" w:w="1728"/>
             <w:shd w:fill="FFFFFF"/>
             <w:tcMar>
               <w:top w:w="100" w:type="dxa"/>
@@ -6800,7 +7960,7 @@
         </w:tc>
         <w:tc>
           <w:tcPr>
-            <w:tcW w:type="dxa" w:w="2880"/>
+            <w:tcW w:type="dxa" w:w="3168"/>
             <w:shd w:fill="FFFFFF"/>
             <w:tcMar>
               <w:top w:w="100" w:type="dxa"/>
@@ -6828,7 +7988,7 @@
       <w:tr>
         <w:tc>
           <w:tcPr>
-            <w:tcW w:type="dxa" w:w="1296"/>
+            <w:tcW w:type="dxa" w:w="1152"/>
             <w:shd w:fill="F8FAFC"/>
             <w:tcMar>
               <w:top w:w="100" w:type="dxa"/>
@@ -6880,7 +8040,7 @@
         </w:tc>
         <w:tc>
           <w:tcPr>
-            <w:tcW w:type="dxa" w:w="1872"/>
+            <w:tcW w:type="dxa" w:w="1728"/>
             <w:shd w:fill="F8FAFC"/>
             <w:tcMar>
               <w:top w:w="100" w:type="dxa"/>
@@ -6906,7 +8066,7 @@
         </w:tc>
         <w:tc>
           <w:tcPr>
-            <w:tcW w:type="dxa" w:w="2880"/>
+            <w:tcW w:type="dxa" w:w="3168"/>
             <w:shd w:fill="F8FAFC"/>
             <w:tcMar>
               <w:top w:w="100" w:type="dxa"/>
@@ -6934,7 +8094,7 @@
       <w:tr>
         <w:tc>
           <w:tcPr>
-            <w:tcW w:type="dxa" w:w="1296"/>
+            <w:tcW w:type="dxa" w:w="1152"/>
             <w:shd w:fill="FFFFFF"/>
             <w:tcMar>
               <w:top w:w="100" w:type="dxa"/>
@@ -6986,7 +8146,7 @@
         </w:tc>
         <w:tc>
           <w:tcPr>
-            <w:tcW w:type="dxa" w:w="1872"/>
+            <w:tcW w:type="dxa" w:w="1728"/>
             <w:shd w:fill="FFFFFF"/>
             <w:tcMar>
               <w:top w:w="100" w:type="dxa"/>
@@ -7012,7 +8172,7 @@
         </w:tc>
         <w:tc>
           <w:tcPr>
-            <w:tcW w:type="dxa" w:w="2880"/>
+            <w:tcW w:type="dxa" w:w="3168"/>
             <w:shd w:fill="FFFFFF"/>
             <w:tcMar>
               <w:top w:w="100" w:type="dxa"/>
@@ -7040,7 +8200,7 @@
       <w:tr>
         <w:tc>
           <w:tcPr>
-            <w:tcW w:type="dxa" w:w="1296"/>
+            <w:tcW w:type="dxa" w:w="1152"/>
             <w:shd w:fill="F8FAFC"/>
             <w:tcMar>
               <w:top w:w="100" w:type="dxa"/>
@@ -7092,7 +8252,7 @@
         </w:tc>
         <w:tc>
           <w:tcPr>
-            <w:tcW w:type="dxa" w:w="1872"/>
+            <w:tcW w:type="dxa" w:w="1728"/>
             <w:shd w:fill="F8FAFC"/>
             <w:tcMar>
               <w:top w:w="100" w:type="dxa"/>
@@ -7118,7 +8278,7 @@
         </w:tc>
         <w:tc>
           <w:tcPr>
-            <w:tcW w:type="dxa" w:w="2880"/>
+            <w:tcW w:type="dxa" w:w="3168"/>
             <w:shd w:fill="F8FAFC"/>
             <w:tcMar>
               <w:top w:w="100" w:type="dxa"/>
@@ -7146,7 +8306,7 @@
       <w:tr>
         <w:tc>
           <w:tcPr>
-            <w:tcW w:type="dxa" w:w="1296"/>
+            <w:tcW w:type="dxa" w:w="1152"/>
             <w:shd w:fill="FFFFFF"/>
             <w:tcMar>
               <w:top w:w="100" w:type="dxa"/>
@@ -7198,7 +8358,7 @@
         </w:tc>
         <w:tc>
           <w:tcPr>
-            <w:tcW w:type="dxa" w:w="1872"/>
+            <w:tcW w:type="dxa" w:w="1728"/>
             <w:shd w:fill="FFFFFF"/>
             <w:tcMar>
               <w:top w:w="100" w:type="dxa"/>
@@ -7224,7 +8384,7 @@
         </w:tc>
         <w:tc>
           <w:tcPr>
-            <w:tcW w:type="dxa" w:w="2880"/>
+            <w:tcW w:type="dxa" w:w="3168"/>
             <w:shd w:fill="FFFFFF"/>
             <w:tcMar>
               <w:top w:w="100" w:type="dxa"/>
@@ -7252,7 +8412,7 @@
       <w:tr>
         <w:tc>
           <w:tcPr>
-            <w:tcW w:type="dxa" w:w="1296"/>
+            <w:tcW w:type="dxa" w:w="1152"/>
             <w:shd w:fill="F8FAFC"/>
             <w:tcMar>
               <w:top w:w="100" w:type="dxa"/>
@@ -7304,7 +8464,7 @@
         </w:tc>
         <w:tc>
           <w:tcPr>
-            <w:tcW w:type="dxa" w:w="1872"/>
+            <w:tcW w:type="dxa" w:w="1728"/>
             <w:shd w:fill="F8FAFC"/>
             <w:tcMar>
               <w:top w:w="100" w:type="dxa"/>
@@ -7330,7 +8490,7 @@
         </w:tc>
         <w:tc>
           <w:tcPr>
-            <w:tcW w:type="dxa" w:w="2880"/>
+            <w:tcW w:type="dxa" w:w="3168"/>
             <w:shd w:fill="F8FAFC"/>
             <w:tcMar>
               <w:top w:w="100" w:type="dxa"/>
@@ -7358,7 +8518,7 @@
       <w:tr>
         <w:tc>
           <w:tcPr>
-            <w:tcW w:type="dxa" w:w="1296"/>
+            <w:tcW w:type="dxa" w:w="1152"/>
             <w:shd w:fill="FFFFFF"/>
             <w:tcMar>
               <w:top w:w="100" w:type="dxa"/>
@@ -7410,7 +8570,7 @@
         </w:tc>
         <w:tc>
           <w:tcPr>
-            <w:tcW w:type="dxa" w:w="1872"/>
+            <w:tcW w:type="dxa" w:w="1728"/>
             <w:shd w:fill="FFFFFF"/>
             <w:tcMar>
               <w:top w:w="100" w:type="dxa"/>
@@ -7436,7 +8596,7 @@
         </w:tc>
         <w:tc>
           <w:tcPr>
-            <w:tcW w:type="dxa" w:w="2880"/>
+            <w:tcW w:type="dxa" w:w="3168"/>
             <w:shd w:fill="FFFFFF"/>
             <w:tcMar>
               <w:top w:w="100" w:type="dxa"/>

</xml_diff>